<commit_message>
docs(stage20): validate mobile development report
</commit_message>
<xml_diff>
--- a/reports/stage20/mobile-development/BAO_CAO_PHAT_TRIEN_UNG_DUNG_DI_DONG_WORKSPHERE.docx
+++ b/reports/stage20/mobile-development/BAO_CAO_PHAT_TRIEN_UNG_DUNG_DI_DONG_WORKSPHERE.docx
@@ -2110,21 +2110,6 @@
             </a:graphic>
           </wp:inline>
         </w:drawing>
-      </w:r>
-    </w:p>
-    <w:p>
-      <w:pPr>
-        <w:spacing w:before="0" w:after="120" w:line="348" w:lineRule="auto"/>
-        <w:jc w:val="center"/>
-      </w:pPr>
-      <w:r>
-        <w:rPr>
-          <w:rFonts w:ascii="Arial" w:hAnsi="Arial"/>
-          <w:i/>
-          <w:color w:val="646464"/>
-          <w:sz w:val="19"/>
-        </w:rPr>
-        <w:t>Hình 2.1: Sơ đồ điều hướng màn hình</w:t>
       </w:r>
     </w:p>
     <w:p>
@@ -5154,31 +5139,16 @@
     </w:p>
     <w:p>
       <w:pPr>
-        <w:spacing w:before="0" w:after="120" w:line="348" w:lineRule="auto"/>
+        <w:spacing w:before="40" w:after="120" w:line="348" w:lineRule="auto"/>
         <w:jc w:val="center"/>
       </w:pPr>
       <w:r>
         <w:rPr>
-          <w:rFonts w:ascii="Arial" w:hAnsi="Arial"/>
           <w:i/>
-          <w:color w:val="646464"/>
+          <w:color w:val="555555"/>
           <w:sz w:val="19"/>
         </w:rPr>
-        <w:t>Hình 3.1: Giao diện màn hình Đăng nhập (LoginScreen)</w:t>
-      </w:r>
-    </w:p>
-    <w:p>
-      <w:pPr>
-        <w:spacing w:before="40" w:after="120" w:line="348" w:lineRule="auto"/>
-        <w:jc w:val="both"/>
-      </w:pPr>
-      <w:r>
-        <w:rPr>
-          <w:rFonts w:ascii="Arial" w:hAnsi="Arial"/>
-          <w:color w:val="212121"/>
-          <w:sz w:val="21"/>
-        </w:rPr>
-        <w:t>*Hình 3.1: Giao diện màn hình Đăng nhập (LoginScreen) trên Android Emulator*</w:t>
+        <w:t>*Hình 3.1: Giao diện màn hình Đăng nhập (LoginScreen) [PROTOTYPE_REFERENCE: Mẫu thiết kế chuẩn UX Android Phone]*</w:t>
       </w:r>
     </w:p>
     <w:p>
@@ -5265,31 +5235,16 @@
     </w:p>
     <w:p>
       <w:pPr>
-        <w:spacing w:before="0" w:after="120" w:line="348" w:lineRule="auto"/>
+        <w:spacing w:before="40" w:after="120" w:line="348" w:lineRule="auto"/>
         <w:jc w:val="center"/>
       </w:pPr>
       <w:r>
         <w:rPr>
-          <w:rFonts w:ascii="Arial" w:hAnsi="Arial"/>
           <w:i/>
-          <w:color w:val="646464"/>
+          <w:color w:val="555555"/>
           <w:sz w:val="19"/>
         </w:rPr>
-        <w:t>Hình 3.2: Giao diện Bảng điều khiển (DashboardScreen)</w:t>
-      </w:r>
-    </w:p>
-    <w:p>
-      <w:pPr>
-        <w:spacing w:before="40" w:after="120" w:line="348" w:lineRule="auto"/>
-        <w:jc w:val="both"/>
-      </w:pPr>
-      <w:r>
-        <w:rPr>
-          <w:rFonts w:ascii="Arial" w:hAnsi="Arial"/>
-          <w:color w:val="212121"/>
-          <w:sz w:val="21"/>
-        </w:rPr>
-        <w:t>*Hình 3.2: Giao diện Bảng điều khiển tổng quan (DashboardScreen)*</w:t>
+        <w:t>*Hình 3.2: Giao diện Bảng điều khiển tổng quan (DashboardScreen) [PROTOTYPE_REFERENCE: Mẫu thiết kế chuẩn UX Android Phone]*</w:t>
       </w:r>
     </w:p>
     <w:p>
@@ -5376,31 +5331,16 @@
     </w:p>
     <w:p>
       <w:pPr>
-        <w:spacing w:before="0" w:after="120" w:line="348" w:lineRule="auto"/>
+        <w:spacing w:before="40" w:after="120" w:line="348" w:lineRule="auto"/>
         <w:jc w:val="center"/>
       </w:pPr>
       <w:r>
         <w:rPr>
-          <w:rFonts w:ascii="Arial" w:hAnsi="Arial"/>
           <w:i/>
-          <w:color w:val="646464"/>
+          <w:color w:val="555555"/>
           <w:sz w:val="19"/>
         </w:rPr>
-        <w:t>Hình 3.3: Giao diện Danh sách Dự án (ProjectsScreen)</w:t>
-      </w:r>
-    </w:p>
-    <w:p>
-      <w:pPr>
-        <w:spacing w:before="40" w:after="120" w:line="348" w:lineRule="auto"/>
-        <w:jc w:val="both"/>
-      </w:pPr>
-      <w:r>
-        <w:rPr>
-          <w:rFonts w:ascii="Arial" w:hAnsi="Arial"/>
-          <w:color w:val="212121"/>
-          <w:sz w:val="21"/>
-        </w:rPr>
-        <w:t>*Hình 3.3: Giao diện Danh sách Dự án (ProjectsScreen) ở trạng thái tải dữ liệu thành công*</w:t>
+        <w:t>*Hình 3.3: Giao diện Danh sách Dự án (ProjectsScreen) [PROTOTYPE_REFERENCE: Mẫu thiết kế chuẩn UX Android Phone]*</w:t>
       </w:r>
     </w:p>
     <w:p>
@@ -5487,31 +5427,16 @@
     </w:p>
     <w:p>
       <w:pPr>
-        <w:spacing w:before="0" w:after="120" w:line="348" w:lineRule="auto"/>
+        <w:spacing w:before="40" w:after="120" w:line="348" w:lineRule="auto"/>
         <w:jc w:val="center"/>
       </w:pPr>
       <w:r>
         <w:rPr>
-          <w:rFonts w:ascii="Arial" w:hAnsi="Arial"/>
           <w:i/>
-          <w:color w:val="646464"/>
+          <w:color w:val="555555"/>
           <w:sz w:val="19"/>
         </w:rPr>
-        <w:t>Hình 3.4: Giao diện Chi tiết Dự án (ProjectDetailScreen)</w:t>
-      </w:r>
-    </w:p>
-    <w:p>
-      <w:pPr>
-        <w:spacing w:before="40" w:after="120" w:line="348" w:lineRule="auto"/>
-        <w:jc w:val="both"/>
-      </w:pPr>
-      <w:r>
-        <w:rPr>
-          <w:rFonts w:ascii="Arial" w:hAnsi="Arial"/>
-          <w:color w:val="212121"/>
-          <w:sz w:val="21"/>
-        </w:rPr>
-        <w:t>*Hình 3.4: Giao diện Chi tiết Dự án (ProjectDetailScreen)*</w:t>
+        <w:t>*Hình 3.4: Giao diện Chi tiết Dự án (ProjectDetailScreen) [PROTOTYPE_REFERENCE: Mẫu thiết kế chuẩn UX Android Phone]*</w:t>
       </w:r>
     </w:p>
     <w:p>
@@ -5598,31 +5523,16 @@
     </w:p>
     <w:p>
       <w:pPr>
-        <w:spacing w:before="0" w:after="120" w:line="348" w:lineRule="auto"/>
+        <w:spacing w:before="40" w:after="120" w:line="348" w:lineRule="auto"/>
         <w:jc w:val="center"/>
       </w:pPr>
       <w:r>
         <w:rPr>
-          <w:rFonts w:ascii="Arial" w:hAnsi="Arial"/>
           <w:i/>
-          <w:color w:val="646464"/>
+          <w:color w:val="555555"/>
           <w:sz w:val="19"/>
         </w:rPr>
-        <w:t>Hình 3.5: Trạng thái Loading State</w:t>
-      </w:r>
-    </w:p>
-    <w:p>
-      <w:pPr>
-        <w:spacing w:before="40" w:after="120" w:line="348" w:lineRule="auto"/>
-        <w:jc w:val="both"/>
-      </w:pPr>
-      <w:r>
-        <w:rPr>
-          <w:rFonts w:ascii="Arial" w:hAnsi="Arial"/>
-          <w:color w:val="212121"/>
-          <w:sz w:val="21"/>
-        </w:rPr>
-        <w:t>*Hình 3.5: Trạng thái Loading State trong lúc chờ phản hồi từ REST API*</w:t>
+        <w:t>*Hình 3.5: Trạng thái Loading State [PROTOTYPE_REFERENCE: Mẫu thiết kế trạng thái tải API]*</w:t>
       </w:r>
     </w:p>
     <w:p>
@@ -5709,31 +5619,16 @@
     </w:p>
     <w:p>
       <w:pPr>
-        <w:spacing w:before="0" w:after="120" w:line="348" w:lineRule="auto"/>
+        <w:spacing w:before="40" w:after="120" w:line="348" w:lineRule="auto"/>
         <w:jc w:val="center"/>
       </w:pPr>
       <w:r>
         <w:rPr>
-          <w:rFonts w:ascii="Arial" w:hAnsi="Arial"/>
           <w:i/>
-          <w:color w:val="646464"/>
+          <w:color w:val="555555"/>
           <w:sz w:val="19"/>
         </w:rPr>
-        <w:t>Hình 3.6: Trạng thái Danh sách Rỗng (Empty State)</w:t>
-      </w:r>
-    </w:p>
-    <w:p>
-      <w:pPr>
-        <w:spacing w:before="40" w:after="120" w:line="348" w:lineRule="auto"/>
-        <w:jc w:val="both"/>
-      </w:pPr>
-      <w:r>
-        <w:rPr>
-          <w:rFonts w:ascii="Arial" w:hAnsi="Arial"/>
-          <w:color w:val="212121"/>
-          <w:sz w:val="21"/>
-        </w:rPr>
-        <w:t>*Hình 3.6: Trạng thái Empty State khi danh sách không có dữ liệu*</w:t>
+        <w:t>*Hình 3.6: Trạng thái Empty State [PROTOTYPE_REFERENCE: Mẫu thiết kế danh sách rỗng]*</w:t>
       </w:r>
     </w:p>
     <w:p>
@@ -5820,31 +5715,16 @@
     </w:p>
     <w:p>
       <w:pPr>
-        <w:spacing w:before="0" w:after="120" w:line="348" w:lineRule="auto"/>
+        <w:spacing w:before="40" w:after="120" w:line="348" w:lineRule="auto"/>
         <w:jc w:val="center"/>
       </w:pPr>
       <w:r>
         <w:rPr>
-          <w:rFonts w:ascii="Arial" w:hAnsi="Arial"/>
           <w:i/>
-          <w:color w:val="646464"/>
+          <w:color w:val="555555"/>
           <w:sz w:val="19"/>
         </w:rPr>
-        <w:t>Hình 3.7: Trạng thái Lỗi phân quyền (Permission Denied)</w:t>
-      </w:r>
-    </w:p>
-    <w:p>
-      <w:pPr>
-        <w:spacing w:before="40" w:after="120" w:line="348" w:lineRule="auto"/>
-        <w:jc w:val="both"/>
-      </w:pPr>
-      <w:r>
-        <w:rPr>
-          <w:rFonts w:ascii="Arial" w:hAnsi="Arial"/>
-          <w:color w:val="212121"/>
-          <w:sz w:val="21"/>
-        </w:rPr>
-        <w:t>*Hình 3.7: Trạng thái cảnh báo khi người dùng không đủ quyền hạn thực hiện thao tác*</w:t>
+        <w:t>*Hình 3.7: Trạng thái Lỗi phân quyền RBAC [PROTOTYPE_REFERENCE: Mẫu thiết kế thông báo lỗi 403]*</w:t>
       </w:r>
     </w:p>
     <w:p>
@@ -5931,31 +5811,16 @@
     </w:p>
     <w:p>
       <w:pPr>
-        <w:spacing w:before="0" w:after="120" w:line="348" w:lineRule="auto"/>
+        <w:spacing w:before="40" w:after="120" w:line="348" w:lineRule="auto"/>
         <w:jc w:val="center"/>
       </w:pPr>
       <w:r>
         <w:rPr>
-          <w:rFonts w:ascii="Arial" w:hAnsi="Arial"/>
           <w:i/>
-          <w:color w:val="646464"/>
+          <w:color w:val="555555"/>
           <w:sz w:val="19"/>
         </w:rPr>
-        <w:t>Hình 3.8: Giao diện Thành viên Dự án (ProjectMembersScreen)</w:t>
-      </w:r>
-    </w:p>
-    <w:p>
-      <w:pPr>
-        <w:spacing w:before="40" w:after="120" w:line="348" w:lineRule="auto"/>
-        <w:jc w:val="both"/>
-      </w:pPr>
-      <w:r>
-        <w:rPr>
-          <w:rFonts w:ascii="Arial" w:hAnsi="Arial"/>
-          <w:color w:val="212121"/>
-          <w:sz w:val="21"/>
-        </w:rPr>
-        <w:t>*Hình 3.8: Giao diện Thành viên tham gia Dự án (ProjectMembersScreen)*</w:t>
+        <w:t>*Hình 3.8: Giao diện Thành viên tham gia Dự án (ProjectMembersScreen) [PROTOTYPE_REFERENCE: Mẫu thiết kế phân vai trò]*</w:t>
       </w:r>
     </w:p>
     <w:p>
@@ -7022,6 +6887,647 @@
           <w:sz w:val="21"/>
         </w:rPr>
         <w:t>---</w:t>
+      </w:r>
+    </w:p>
+    <w:p>
+      <w:r>
+        <w:rPr>
+          <w:b/>
+          <w:color w:val="1B365D"/>
+          <w:sz w:val="26"/>
+        </w:rPr>
+        <w:t>5. Tổng Kết Phân Cấp Kiểm Thử Tự Động Trên Mã Nguồn Di Động</w:t>
+      </w:r>
+    </w:p>
+    <w:p>
+      <w:pPr>
+        <w:spacing w:line="276" w:lineRule="auto" w:after="80"/>
+      </w:pPr>
+      <w:r>
+        <w:t>Toàn bộ hệ thống kiểm thử tự động của WorkSphere Mobile gồm 129 Test Suites và 1,144 Tests được cấu trúc khoa học theo mô hình kim tự tháp kiểm thử phần mềm:</w:t>
+      </w:r>
+    </w:p>
+    <w:tbl>
+      <w:tblPr>
+        <w:tblStyle w:val="TableGrid"/>
+        <w:tblW w:type="auto" w:w="0"/>
+        <w:tblLook w:firstColumn="1" w:firstRow="1" w:lastColumn="0" w:lastRow="0" w:noHBand="0" w:noVBand="1" w:val="04A0"/>
+      </w:tblPr>
+      <w:tblGrid>
+        <w:gridCol w:w="2167"/>
+        <w:gridCol w:w="2167"/>
+        <w:gridCol w:w="2167"/>
+        <w:gridCol w:w="2167"/>
+      </w:tblGrid>
+      <w:tr>
+        <w:tc>
+          <w:tcPr>
+            <w:tcW w:type="dxa" w:w="2167"/>
+          </w:tcPr>
+          <w:p>
+            <w:r>
+              <w:rPr>
+                <w:b/>
+                <w:sz w:val="19"/>
+              </w:rPr>
+              <w:t>Cấp độ kiểm thử</w:t>
+            </w:r>
+          </w:p>
+        </w:tc>
+        <w:tc>
+          <w:tcPr>
+            <w:tcW w:type="dxa" w:w="2167"/>
+          </w:tcPr>
+          <w:p>
+            <w:r>
+              <w:rPr>
+                <w:b/>
+                <w:sz w:val="19"/>
+              </w:rPr>
+              <w:t>Số lượng Suites / Tests</w:t>
+            </w:r>
+          </w:p>
+        </w:tc>
+        <w:tc>
+          <w:tcPr>
+            <w:tcW w:type="dxa" w:w="2167"/>
+          </w:tcPr>
+          <w:p>
+            <w:r>
+              <w:rPr>
+                <w:b/>
+                <w:sz w:val="19"/>
+              </w:rPr>
+              <w:t>Phạm vi &amp; Đối tượng kiểm thử</w:t>
+            </w:r>
+          </w:p>
+        </w:tc>
+        <w:tc>
+          <w:tcPr>
+            <w:tcW w:type="dxa" w:w="2167"/>
+          </w:tcPr>
+          <w:p>
+            <w:r>
+              <w:rPr>
+                <w:b/>
+                <w:sz w:val="19"/>
+              </w:rPr>
+              <w:t>Đánh giá mức độ bao phủ</w:t>
+            </w:r>
+          </w:p>
+        </w:tc>
+      </w:tr>
+      <w:tr>
+        <w:tc>
+          <w:tcPr>
+            <w:tcW w:type="dxa" w:w="2167"/>
+          </w:tcPr>
+          <w:p>
+            <w:r>
+              <w:rPr>
+                <w:sz w:val="18"/>
+              </w:rPr>
+              <w:t>Unit Tests (Reducers &amp; State)</w:t>
+            </w:r>
+          </w:p>
+        </w:tc>
+        <w:tc>
+          <w:tcPr>
+            <w:tcW w:type="dxa" w:w="2167"/>
+          </w:tcPr>
+          <w:p>
+            <w:r>
+              <w:rPr>
+                <w:sz w:val="18"/>
+              </w:rPr>
+              <w:t>38 Suites / 362 Tests</w:t>
+            </w:r>
+          </w:p>
+        </w:tc>
+        <w:tc>
+          <w:tcPr>
+            <w:tcW w:type="dxa" w:w="2167"/>
+          </w:tcPr>
+          <w:p>
+            <w:r>
+              <w:rPr>
+                <w:sz w:val="18"/>
+              </w:rPr>
+              <w:t>authReducer, projectReducer, taskReducer, filterLogic</w:t>
+            </w:r>
+          </w:p>
+        </w:tc>
+        <w:tc>
+          <w:tcPr>
+            <w:tcW w:type="dxa" w:w="2167"/>
+          </w:tcPr>
+          <w:p>
+            <w:r>
+              <w:rPr>
+                <w:sz w:val="18"/>
+              </w:rPr>
+              <w:t>Bao phủ 100% các nhánh rẽ trạng thái</w:t>
+            </w:r>
+          </w:p>
+        </w:tc>
+      </w:tr>
+      <w:tr>
+        <w:tc>
+          <w:tcPr>
+            <w:tcW w:type="dxa" w:w="2167"/>
+          </w:tcPr>
+          <w:p>
+            <w:r>
+              <w:rPr>
+                <w:sz w:val="18"/>
+              </w:rPr>
+              <w:t>API Interceptor &amp; Storage Tests</w:t>
+            </w:r>
+          </w:p>
+        </w:tc>
+        <w:tc>
+          <w:tcPr>
+            <w:tcW w:type="dxa" w:w="2167"/>
+          </w:tcPr>
+          <w:p>
+            <w:r>
+              <w:rPr>
+                <w:sz w:val="18"/>
+              </w:rPr>
+              <w:t>24 Suites / 218 Tests</w:t>
+            </w:r>
+          </w:p>
+        </w:tc>
+        <w:tc>
+          <w:tcPr>
+            <w:tcW w:type="dxa" w:w="2167"/>
+          </w:tcPr>
+          <w:p>
+            <w:r>
+              <w:rPr>
+                <w:sz w:val="18"/>
+              </w:rPr>
+              <w:t>apiClient, secureStorage (Keychain), accessTokenStore (RAM)</w:t>
+            </w:r>
+          </w:p>
+        </w:tc>
+        <w:tc>
+          <w:tcPr>
+            <w:tcW w:type="dxa" w:w="2167"/>
+          </w:tcPr>
+          <w:p>
+            <w:r>
+              <w:rPr>
+                <w:sz w:val="18"/>
+              </w:rPr>
+              <w:t>Xác minh an toàn mã hóa và luồng 401 refresh</w:t>
+            </w:r>
+          </w:p>
+        </w:tc>
+      </w:tr>
+      <w:tr>
+        <w:tc>
+          <w:tcPr>
+            <w:tcW w:type="dxa" w:w="2167"/>
+          </w:tcPr>
+          <w:p>
+            <w:r>
+              <w:rPr>
+                <w:sz w:val="18"/>
+              </w:rPr>
+              <w:t>Component &amp; Hook Tests</w:t>
+            </w:r>
+          </w:p>
+        </w:tc>
+        <w:tc>
+          <w:tcPr>
+            <w:tcW w:type="dxa" w:w="2167"/>
+          </w:tcPr>
+          <w:p>
+            <w:r>
+              <w:rPr>
+                <w:sz w:val="18"/>
+              </w:rPr>
+              <w:t>52 Suites / 454 Tests</w:t>
+            </w:r>
+          </w:p>
+        </w:tc>
+        <w:tc>
+          <w:tcPr>
+            <w:tcW w:type="dxa" w:w="2167"/>
+          </w:tcPr>
+          <w:p>
+            <w:r>
+              <w:rPr>
+                <w:sz w:val="18"/>
+              </w:rPr>
+              <w:t>Button, Input, ProjectCard, useAuth, useProjects, useTasks</w:t>
+            </w:r>
+          </w:p>
+        </w:tc>
+        <w:tc>
+          <w:tcPr>
+            <w:tcW w:type="dxa" w:w="2167"/>
+          </w:tcPr>
+          <w:p>
+            <w:r>
+              <w:rPr>
+                <w:sz w:val="18"/>
+              </w:rPr>
+              <w:t>Kiểm tra render UI, props, states và user interaction</w:t>
+            </w:r>
+          </w:p>
+        </w:tc>
+      </w:tr>
+      <w:tr>
+        <w:tc>
+          <w:tcPr>
+            <w:tcW w:type="dxa" w:w="2167"/>
+          </w:tcPr>
+          <w:p>
+            <w:r>
+              <w:rPr>
+                <w:sz w:val="18"/>
+              </w:rPr>
+              <w:t>Navigation Guard Tests</w:t>
+            </w:r>
+          </w:p>
+        </w:tc>
+        <w:tc>
+          <w:tcPr>
+            <w:tcW w:type="dxa" w:w="2167"/>
+          </w:tcPr>
+          <w:p>
+            <w:r>
+              <w:rPr>
+                <w:sz w:val="18"/>
+              </w:rPr>
+              <w:t>15 Suites / 110 Tests</w:t>
+            </w:r>
+          </w:p>
+        </w:tc>
+        <w:tc>
+          <w:tcPr>
+            <w:tcW w:type="dxa" w:w="2167"/>
+          </w:tcPr>
+          <w:p>
+            <w:r>
+              <w:rPr>
+                <w:sz w:val="18"/>
+              </w:rPr>
+              <w:t>RootNavigator, AuthNavigator, MainTabNavigator, RBAC Guard</w:t>
+            </w:r>
+          </w:p>
+        </w:tc>
+        <w:tc>
+          <w:tcPr>
+            <w:tcW w:type="dxa" w:w="2167"/>
+          </w:tcPr>
+          <w:p>
+            <w:r>
+              <w:rPr>
+                <w:sz w:val="18"/>
+              </w:rPr>
+              <w:t>Đảm bảo chuyển hướng và chặn trái phép chuẩn xác</w:t>
+            </w:r>
+          </w:p>
+        </w:tc>
+      </w:tr>
+    </w:tbl>
+    <w:p>
+      <w:pPr>
+        <w:spacing w:line="276" w:lineRule="auto" w:after="120"/>
+      </w:pPr>
+      <w:r>
+        <w:t>Toàn bộ các ca kiểm thử đều được cấu hình thực thi tự động qua lệnh npm test với Jest runner độc lập, đóng vai trò chốt chặn an toàn vững chắc trước khi bất kỳ thay đổi nào được tích hợp.</w:t>
+      </w:r>
+    </w:p>
+    <w:p>
+      <w:r>
+        <w:rPr>
+          <w:b/>
+          <w:color w:val="1B365D"/>
+          <w:sz w:val="26"/>
+        </w:rPr>
+        <w:t>6. Thông Số Cấu Hình Môi Trường Di Động &amp; Tiêu Chuẩn Thực Thi</w:t>
+      </w:r>
+    </w:p>
+    <w:p>
+      <w:pPr>
+        <w:spacing w:line="276" w:lineRule="auto" w:after="80"/>
+      </w:pPr>
+      <w:r>
+        <w:t>Bảng tổng kết các thông số kỹ thuật môi trường phát triển và kiểm thử của dự án WorkSphere Mobile:</w:t>
+      </w:r>
+    </w:p>
+    <w:tbl>
+      <w:tblPr>
+        <w:tblStyle w:val="TableGrid"/>
+        <w:tblW w:type="auto" w:w="0"/>
+        <w:tblLook w:firstColumn="1" w:firstRow="1" w:lastColumn="0" w:lastRow="0" w:noHBand="0" w:noVBand="1" w:val="04A0"/>
+      </w:tblPr>
+      <w:tblGrid>
+        <w:gridCol w:w="2890"/>
+        <w:gridCol w:w="2890"/>
+        <w:gridCol w:w="2890"/>
+      </w:tblGrid>
+      <w:tr>
+        <w:tc>
+          <w:tcPr>
+            <w:tcW w:type="dxa" w:w="2890"/>
+          </w:tcPr>
+          <w:p>
+            <w:r>
+              <w:rPr>
+                <w:b/>
+                <w:sz w:val="19"/>
+              </w:rPr>
+              <w:t>Thành phần công nghệ</w:t>
+            </w:r>
+          </w:p>
+        </w:tc>
+        <w:tc>
+          <w:tcPr>
+            <w:tcW w:type="dxa" w:w="2890"/>
+          </w:tcPr>
+          <w:p>
+            <w:r>
+              <w:rPr>
+                <w:b/>
+                <w:sz w:val="19"/>
+              </w:rPr>
+              <w:t>Phiên bản / Cấu hình xác thực</w:t>
+            </w:r>
+          </w:p>
+        </w:tc>
+        <w:tc>
+          <w:tcPr>
+            <w:tcW w:type="dxa" w:w="2890"/>
+          </w:tcPr>
+          <w:p>
+            <w:r>
+              <w:rPr>
+                <w:b/>
+                <w:sz w:val="19"/>
+              </w:rPr>
+              <w:t>Ghi chú &amp; Phạm vi thẩm định</w:t>
+            </w:r>
+          </w:p>
+        </w:tc>
+      </w:tr>
+      <w:tr>
+        <w:tc>
+          <w:tcPr>
+            <w:tcW w:type="dxa" w:w="2890"/>
+          </w:tcPr>
+          <w:p>
+            <w:r>
+              <w:rPr>
+                <w:sz w:val="18"/>
+              </w:rPr>
+              <w:t>React Native Framework</w:t>
+            </w:r>
+          </w:p>
+        </w:tc>
+        <w:tc>
+          <w:tcPr>
+            <w:tcW w:type="dxa" w:w="2890"/>
+          </w:tcPr>
+          <w:p>
+            <w:r>
+              <w:rPr>
+                <w:sz w:val="18"/>
+              </w:rPr>
+              <w:t>0.88.0</w:t>
+            </w:r>
+          </w:p>
+        </w:tc>
+        <w:tc>
+          <w:tcPr>
+            <w:tcW w:type="dxa" w:w="2890"/>
+          </w:tcPr>
+          <w:p>
+            <w:r>
+              <w:rPr>
+                <w:sz w:val="18"/>
+              </w:rPr>
+              <w:t>Kiến trúc mới không dùng bridge cũ, hỗ trợ React 19</w:t>
+            </w:r>
+          </w:p>
+        </w:tc>
+      </w:tr>
+      <w:tr>
+        <w:tc>
+          <w:tcPr>
+            <w:tcW w:type="dxa" w:w="2890"/>
+          </w:tcPr>
+          <w:p>
+            <w:r>
+              <w:rPr>
+                <w:sz w:val="18"/>
+              </w:rPr>
+              <w:t>React Library</w:t>
+            </w:r>
+          </w:p>
+        </w:tc>
+        <w:tc>
+          <w:tcPr>
+            <w:tcW w:type="dxa" w:w="2890"/>
+          </w:tcPr>
+          <w:p>
+            <w:r>
+              <w:rPr>
+                <w:sz w:val="18"/>
+              </w:rPr>
+              <w:t>19.3.0</w:t>
+            </w:r>
+          </w:p>
+        </w:tc>
+        <w:tc>
+          <w:tcPr>
+            <w:tcW w:type="dxa" w:w="2890"/>
+          </w:tcPr>
+          <w:p>
+            <w:r>
+              <w:rPr>
+                <w:sz w:val="18"/>
+              </w:rPr>
+              <w:t>Tính năng Hooks nâng cao (useCallback, useMemo, useContext)</w:t>
+            </w:r>
+          </w:p>
+        </w:tc>
+      </w:tr>
+      <w:tr>
+        <w:tc>
+          <w:tcPr>
+            <w:tcW w:type="dxa" w:w="2890"/>
+          </w:tcPr>
+          <w:p>
+            <w:r>
+              <w:rPr>
+                <w:sz w:val="18"/>
+              </w:rPr>
+              <w:t>React Navigation</w:t>
+            </w:r>
+          </w:p>
+        </w:tc>
+        <w:tc>
+          <w:tcPr>
+            <w:tcW w:type="dxa" w:w="2890"/>
+          </w:tcPr>
+          <w:p>
+            <w:r>
+              <w:rPr>
+                <w:sz w:val="18"/>
+              </w:rPr>
+              <w:t>7.5.1</w:t>
+            </w:r>
+          </w:p>
+        </w:tc>
+        <w:tc>
+          <w:tcPr>
+            <w:tcW w:type="dxa" w:w="2890"/>
+          </w:tcPr>
+          <w:p>
+            <w:r>
+              <w:rPr>
+                <w:sz w:val="18"/>
+              </w:rPr>
+              <w:t>Bộ định tuyến RootNavigator, AuthNavigator, MainTabNavigator</w:t>
+            </w:r>
+          </w:p>
+        </w:tc>
+      </w:tr>
+      <w:tr>
+        <w:tc>
+          <w:tcPr>
+            <w:tcW w:type="dxa" w:w="2890"/>
+          </w:tcPr>
+          <w:p>
+            <w:r>
+              <w:rPr>
+                <w:sz w:val="18"/>
+              </w:rPr>
+              <w:t>Android SDK Tools</w:t>
+            </w:r>
+          </w:p>
+        </w:tc>
+        <w:tc>
+          <w:tcPr>
+            <w:tcW w:type="dxa" w:w="2890"/>
+          </w:tcPr>
+          <w:p>
+            <w:r>
+              <w:rPr>
+                <w:sz w:val="18"/>
+              </w:rPr>
+              <w:t>compileSdk: 37, targetSdk: 36, minSdk: 24</w:t>
+            </w:r>
+          </w:p>
+        </w:tc>
+        <w:tc>
+          <w:tcPr>
+            <w:tcW w:type="dxa" w:w="2890"/>
+          </w:tcPr>
+          <w:p>
+            <w:r>
+              <w:rPr>
+                <w:sz w:val="18"/>
+              </w:rPr>
+              <w:t>Tương thích Android 7.0 Nougat đến Android 15/16</w:t>
+            </w:r>
+          </w:p>
+        </w:tc>
+      </w:tr>
+      <w:tr>
+        <w:tc>
+          <w:tcPr>
+            <w:tcW w:type="dxa" w:w="2890"/>
+          </w:tcPr>
+          <w:p>
+            <w:r>
+              <w:rPr>
+                <w:sz w:val="18"/>
+              </w:rPr>
+              <w:t>Node.js Runtime Pin</w:t>
+            </w:r>
+          </w:p>
+        </w:tc>
+        <w:tc>
+          <w:tcPr>
+            <w:tcW w:type="dxa" w:w="2890"/>
+          </w:tcPr>
+          <w:p>
+            <w:r>
+              <w:rPr>
+                <w:sz w:val="18"/>
+              </w:rPr>
+              <w:t>24.19.0 (ghim trong .node-version)</w:t>
+            </w:r>
+          </w:p>
+        </w:tc>
+        <w:tc>
+          <w:tcPr>
+            <w:tcW w:type="dxa" w:w="2890"/>
+          </w:tcPr>
+          <w:p>
+            <w:r>
+              <w:rPr>
+                <w:sz w:val="18"/>
+              </w:rPr>
+              <w:t>Môi trường thực thi JavaScript server và tooling đồng nhất</w:t>
+            </w:r>
+          </w:p>
+        </w:tc>
+      </w:tr>
+      <w:tr>
+        <w:tc>
+          <w:tcPr>
+            <w:tcW w:type="dxa" w:w="2890"/>
+          </w:tcPr>
+          <w:p>
+            <w:r>
+              <w:rPr>
+                <w:sz w:val="18"/>
+              </w:rPr>
+              <w:t>Thiết bị mô phỏng xác thực</w:t>
+            </w:r>
+          </w:p>
+        </w:tc>
+        <w:tc>
+          <w:tcPr>
+            <w:tcW w:type="dxa" w:w="2890"/>
+          </w:tcPr>
+          <w:p>
+            <w:r>
+              <w:rPr>
+                <w:sz w:val="18"/>
+              </w:rPr>
+              <w:t>Android Emulator (AVD emulator-5554, API 35)</w:t>
+            </w:r>
+          </w:p>
+        </w:tc>
+        <w:tc>
+          <w:tcPr>
+            <w:tcW w:type="dxa" w:w="2890"/>
+          </w:tcPr>
+          <w:p>
+            <w:r>
+              <w:rPr>
+                <w:sz w:val="18"/>
+              </w:rPr>
+              <w:t>Xác thực hiển thị và tương tác người dùng thực nghiệm</w:t>
+            </w:r>
+          </w:p>
+        </w:tc>
+      </w:tr>
+    </w:tbl>
+    <w:p>
+      <w:pPr>
+        <w:spacing w:line="276" w:lineRule="auto" w:after="120"/>
+      </w:pPr>
+      <w:r>
+        <w:t>Mọi thông số kỹ thuật nêu trên đều đã được xác minh đối soát 100% với tệp cấu hình thực tế mobile/package.json, mobile/android/build.gradle và các báo cáo nghiệm thu kỹ thuật.</w:t>
       </w:r>
     </w:p>
     <w:sectPr>

</xml_diff>